<commit_message>
Word version: clean style template (fixes duplicated default size and pandoc 3.1.3 stray '>')
Co-Authored-By: Claude Opus 5.5 <noreply@anthropic.com>
Claude-Session: https://claude.ai/code/session_01QCNw5yzBHT8VeYMERqCF3G
</commit_message>
<xml_diff>
--- a/paper/main.docx
+++ b/paper/main.docx
@@ -21332,11 +21332,9 @@
   <w:docDefaults>
     <w:rPrDefault>
       <w:rPr>
+        <w:rFonts w:ascii="Times New Roman" w:cs="Times New Roman" w:eastAsia="Times New Roman" w:hAnsi="Times New Roman"/>
         <w:sz w:val="22"/>
         <w:szCs w:val="22"/>
-        <w:rFonts w:ascii="Times New Roman" w:cs="Times New Roman" w:eastAsia="Times New Roman" w:hAnsi="Times New Roman"/>
-        <w:sz w:val="24"/>
-        <w:szCs w:val="24"/>
         <w:lang w:bidi="ar-SA" w:eastAsia="en-US" w:val="en-US"/>
       </w:rPr>
     </w:rPrDefault>
@@ -21389,7 +21387,7 @@
       <w:rFonts w:ascii="Times New Roman" w:cs="Times New Roman" w:eastAsia="Times New Roman" w:hAnsi="Times New Roman"/>
       <w:b/>
       <w:bCs/>
-      <w:color w:themeColor="accent1" w:themeShade="B5" w:val="345A8A"/>
+      <w:color w:val="000000"/>
       <w:sz w:val="36"/>
       <w:szCs w:val="36"/>
     </w:rPr>
@@ -21445,8 +21443,7 @@
       <w:sz w:val="20"/>
       <w:szCs w:val="20"/>
       <w:b/>
-      <w:color w:val="345A8A"/>
-      &gt;
+      <w:color w:val="000000"/>
     </w:rPr>
   </w:style>
   <w:style w:customStyle="1" w:styleId="Abstract" w:type="paragraph">
@@ -21488,7 +21485,7 @@
       <w:rFonts w:ascii="Times New Roman" w:cs="Times New Roman" w:eastAsia="Times New Roman" w:hAnsi="Times New Roman"/>
       <w:b/>
       <w:bCs/>
-      <w:color w:themeColor="accent1" w:val="4F81BD"/>
+      <w:color w:val="000000"/>
       <w:sz w:val="32"/>
       <w:szCs w:val="32"/>
     </w:rPr>
@@ -21510,7 +21507,7 @@
       <w:rFonts w:ascii="Times New Roman" w:cs="Times New Roman" w:eastAsia="Times New Roman" w:hAnsi="Times New Roman"/>
       <w:b/>
       <w:bCs/>
-      <w:color w:themeColor="accent1" w:val="4F81BD"/>
+      <w:color w:val="000000"/>
       <w:sz w:val="28"/>
       <w:szCs w:val="28"/>
     </w:rPr>
@@ -21532,7 +21529,7 @@
       <w:rFonts w:ascii="Times New Roman" w:cs="Times New Roman" w:eastAsia="Times New Roman" w:hAnsi="Times New Roman"/>
       <w:b/>
       <w:bCs/>
-      <w:color w:themeColor="accent1" w:val="4F81BD"/>
+      <w:color w:val="000000"/>
       <w:sz w:val="24"/>
       <w:szCs w:val="24"/>
     </w:rPr>
@@ -21554,7 +21551,7 @@
       <w:rFonts w:ascii="Times New Roman" w:cs="Times New Roman" w:eastAsia="Times New Roman" w:hAnsi="Times New Roman"/>
       <w:i/>
       <w:bCs/>
-      <w:color w:themeColor="accent1" w:val="4F81BD"/>
+      <w:color w:val="000000"/>
       <w:sz w:val="24"/>
       <w:szCs w:val="24"/>
     </w:rPr>
@@ -21575,7 +21572,7 @@
     <w:rPr>
       <w:rFonts w:ascii="Times New Roman" w:cs="Times New Roman" w:eastAsia="Times New Roman" w:hAnsi="Times New Roman"/>
       <w:iCs/>
-      <w:color w:themeColor="accent1" w:val="4F81BD"/>
+      <w:color w:val="000000"/>
       <w:sz w:val="24"/>
       <w:szCs w:val="24"/>
     </w:rPr>
@@ -21595,7 +21592,7 @@
     </w:pPr>
     <w:rPr>
       <w:rFonts w:ascii="Times New Roman" w:cs="Times New Roman" w:eastAsia="Times New Roman" w:hAnsi="Times New Roman"/>
-      <w:color w:themeColor="accent1" w:val="4F81BD"/>
+      <w:color w:val="000000"/>
       <w:sz w:val="24"/>
       <w:szCs w:val="24"/>
     </w:rPr>
@@ -21615,7 +21612,7 @@
     </w:pPr>
     <w:rPr>
       <w:rFonts w:ascii="Times New Roman" w:cs="Times New Roman" w:eastAsia="Times New Roman" w:hAnsi="Times New Roman"/>
-      <w:color w:themeColor="accent1" w:val="4F81BD"/>
+      <w:color w:val="000000"/>
       <w:sz w:val="24"/>
       <w:szCs w:val="24"/>
     </w:rPr>
@@ -21635,7 +21632,7 @@
     </w:pPr>
     <w:rPr>
       <w:rFonts w:ascii="Times New Roman" w:cs="Times New Roman" w:eastAsia="Times New Roman" w:hAnsi="Times New Roman"/>
-      <w:color w:themeColor="accent1" w:val="4F81BD"/>
+      <w:color w:val="000000"/>
       <w:sz w:val="24"/>
       <w:szCs w:val="24"/>
     </w:rPr>
@@ -21655,7 +21652,7 @@
     </w:pPr>
     <w:rPr>
       <w:rFonts w:ascii="Times New Roman" w:cs="Times New Roman" w:eastAsia="Times New Roman" w:hAnsi="Times New Roman"/>
-      <w:color w:themeColor="accent1" w:val="4F81BD"/>
+      <w:color w:val="000000"/>
       <w:sz w:val="24"/>
       <w:szCs w:val="24"/>
     </w:rPr>
@@ -21794,7 +21791,7 @@
     <w:name w:val="Hyperlink"/>
     <w:basedOn w:val="BodyTextChar"/>
     <w:rPr>
-      <w:color w:themeColor="accent1" w:val="4F81BD"/>
+      <w:color w:val="000000"/>
     </w:rPr>
   </w:style>
   <w:style w:styleId="TOCHeading" w:type="paragraph">
@@ -21812,7 +21809,7 @@
       <w:rFonts w:ascii="Times New Roman" w:cs="Times New Roman" w:eastAsia="Times New Roman" w:hAnsi="Times New Roman"/>
       <w:b w:val="0"/>
       <w:bCs w:val="0"/>
-      <w:color w:themeColor="accent1" w:themeShade="BF" w:val="365F91"/>
+      <w:color w:val="000000"/>
     </w:rPr>
   </w:style>
   <w:style w:type="paragraph" w:customStyle="1" w:styleId="SourceCode">

</xml_diff>

<commit_message>
Word version: no duplicate table-cell properties
Co-Authored-By: Claude Opus 5.5 <noreply@anthropic.com>
Claude-Session: https://claude.ai/code/session_01QCNw5yzBHT8VeYMERqCF3G
</commit_message>
<xml_diff>
--- a/paper/main.docx
+++ b/paper/main.docx
@@ -3078,7 +3078,6 @@
           <w:tcPr>
             <w:tcW w:w="3911" w:type="dxa"/>
           </w:tcPr>
-          <w:tcPr/>
           <w:p>
             <w:pPr>
               <w:pStyle w:val="Compact"/>
@@ -3097,7 +3096,6 @@
           <w:tcPr>
             <w:tcW w:w="2707" w:type="dxa"/>
           </w:tcPr>
-          <w:tcPr/>
           <w:p>
             <w:pPr>
               <w:pStyle w:val="Compact"/>
@@ -3116,7 +3114,6 @@
           <w:tcPr>
             <w:tcW w:w="2408" w:type="dxa"/>
           </w:tcPr>
-          <w:tcPr/>
           <w:p>
             <w:pPr>
               <w:pStyle w:val="Compact"/>
@@ -3137,7 +3134,6 @@
           <w:tcPr>
             <w:tcW w:w="3911" w:type="dxa"/>
           </w:tcPr>
-          <w:tcPr/>
           <w:p>
             <w:pPr>
               <w:pStyle w:val="Compact"/>
@@ -3156,7 +3152,6 @@
           <w:tcPr>
             <w:tcW w:w="2707" w:type="dxa"/>
           </w:tcPr>
-          <w:tcPr/>
           <w:p>
             <w:pPr>
               <w:pStyle w:val="Compact"/>
@@ -3175,7 +3170,6 @@
           <w:tcPr>
             <w:tcW w:w="2408" w:type="dxa"/>
           </w:tcPr>
-          <w:tcPr/>
           <w:p>
             <w:pPr>
               <w:pStyle w:val="Compact"/>
@@ -3196,7 +3190,6 @@
           <w:tcPr>
             <w:tcW w:w="3911" w:type="dxa"/>
           </w:tcPr>
-          <w:tcPr/>
           <w:p>
             <w:pPr>
               <w:pStyle w:val="Compact"/>
@@ -3215,7 +3208,6 @@
           <w:tcPr>
             <w:tcW w:w="2707" w:type="dxa"/>
           </w:tcPr>
-          <w:tcPr/>
           <w:p>
             <w:pPr>
               <w:pStyle w:val="Compact"/>
@@ -3234,7 +3226,6 @@
           <w:tcPr>
             <w:tcW w:w="2408" w:type="dxa"/>
           </w:tcPr>
-          <w:tcPr/>
           <w:p>
             <w:pPr>
               <w:pStyle w:val="Compact"/>
@@ -3255,7 +3246,6 @@
           <w:tcPr>
             <w:tcW w:w="3911" w:type="dxa"/>
           </w:tcPr>
-          <w:tcPr/>
           <w:p>
             <w:pPr>
               <w:pStyle w:val="Compact"/>
@@ -3274,7 +3264,6 @@
           <w:tcPr>
             <w:tcW w:w="2707" w:type="dxa"/>
           </w:tcPr>
-          <w:tcPr/>
           <w:p>
             <w:pPr>
               <w:pStyle w:val="Compact"/>
@@ -3293,7 +3282,6 @@
           <w:tcPr>
             <w:tcW w:w="2408" w:type="dxa"/>
           </w:tcPr>
-          <w:tcPr/>
           <w:p>
             <w:pPr>
               <w:pStyle w:val="Compact"/>
@@ -3314,7 +3302,6 @@
           <w:tcPr>
             <w:tcW w:w="3911" w:type="dxa"/>
           </w:tcPr>
-          <w:tcPr/>
           <w:p>
             <w:pPr>
               <w:pStyle w:val="Compact"/>
@@ -3333,7 +3320,6 @@
           <w:tcPr>
             <w:tcW w:w="2707" w:type="dxa"/>
           </w:tcPr>
-          <w:tcPr/>
           <w:p>
             <w:pPr>
               <w:pStyle w:val="Compact"/>
@@ -3352,7 +3338,6 @@
           <w:tcPr>
             <w:tcW w:w="2408" w:type="dxa"/>
           </w:tcPr>
-          <w:tcPr/>
           <w:p>
             <w:pPr>
               <w:pStyle w:val="Compact"/>
@@ -3373,7 +3358,6 @@
           <w:tcPr>
             <w:tcW w:w="3911" w:type="dxa"/>
           </w:tcPr>
-          <w:tcPr/>
           <w:p>
             <w:pPr>
               <w:pStyle w:val="Compact"/>
@@ -3394,7 +3378,6 @@
           <w:tcPr>
             <w:tcW w:w="2707" w:type="dxa"/>
           </w:tcPr>
-          <w:tcPr/>
           <w:p>
             <w:pPr>
               <w:pStyle w:val="Compact"/>
@@ -3415,7 +3398,6 @@
           <w:tcPr>
             <w:tcW w:w="2408" w:type="dxa"/>
           </w:tcPr>
-          <w:tcPr/>
           <w:p>
             <w:pPr>
               <w:pStyle w:val="Compact"/>
@@ -3744,7 +3726,6 @@
           <w:tcPr>
             <w:tcW w:w="3302" w:type="dxa"/>
           </w:tcPr>
-          <w:tcPr/>
           <w:p>
             <w:pPr>
               <w:pStyle w:val="Compact"/>
@@ -3763,7 +3744,6 @@
           <w:tcPr>
             <w:tcW w:w="1981" w:type="dxa"/>
           </w:tcPr>
-          <w:tcPr/>
           <w:p>
             <w:pPr>
               <w:pStyle w:val="Compact"/>
@@ -3782,7 +3762,6 @@
           <w:tcPr>
             <w:tcW w:w="3743" w:type="dxa"/>
           </w:tcPr>
-          <w:tcPr/>
           <w:p>
             <w:pPr>
               <w:pStyle w:val="Compact"/>
@@ -3803,7 +3782,6 @@
           <w:tcPr>
             <w:tcW w:w="3302" w:type="dxa"/>
           </w:tcPr>
-          <w:tcPr/>
           <w:p>
             <w:pPr>
               <w:pStyle w:val="Compact"/>
@@ -3837,7 +3815,6 @@
           <w:tcPr>
             <w:tcW w:w="1981" w:type="dxa"/>
           </w:tcPr>
-          <w:tcPr/>
           <w:p>
             <w:pPr>
               <w:pStyle w:val="Compact"/>
@@ -3856,7 +3833,6 @@
           <w:tcPr>
             <w:tcW w:w="3743" w:type="dxa"/>
           </w:tcPr>
-          <w:tcPr/>
           <w:p>
             <w:pPr>
               <w:pStyle w:val="Compact"/>
@@ -3877,7 +3853,6 @@
           <w:tcPr>
             <w:tcW w:w="3302" w:type="dxa"/>
           </w:tcPr>
-          <w:tcPr/>
           <w:p>
             <w:pPr>
               <w:pStyle w:val="Compact"/>
@@ -3897,7 +3872,6 @@
           <w:tcPr>
             <w:tcW w:w="1981" w:type="dxa"/>
           </w:tcPr>
-          <w:tcPr/>
           <w:p>
             <w:pPr>
               <w:pStyle w:val="Compact"/>
@@ -3916,7 +3890,6 @@
           <w:tcPr>
             <w:tcW w:w="3743" w:type="dxa"/>
           </w:tcPr>
-          <w:tcPr/>
           <w:p>
             <w:pPr>
               <w:pStyle w:val="Compact"/>
@@ -3947,7 +3920,6 @@
           <w:tcPr>
             <w:tcW w:w="3302" w:type="dxa"/>
           </w:tcPr>
-          <w:tcPr/>
           <w:p>
             <w:pPr>
               <w:pStyle w:val="Compact"/>
@@ -3981,7 +3953,6 @@
           <w:tcPr>
             <w:tcW w:w="1981" w:type="dxa"/>
           </w:tcPr>
-          <w:tcPr/>
           <w:p>
             <w:pPr>
               <w:pStyle w:val="Compact"/>
@@ -4000,7 +3971,6 @@
           <w:tcPr>
             <w:tcW w:w="3743" w:type="dxa"/>
           </w:tcPr>
-          <w:tcPr/>
           <w:p>
             <w:pPr>
               <w:pStyle w:val="Compact"/>
@@ -4021,7 +3991,6 @@
           <w:tcPr>
             <w:tcW w:w="3302" w:type="dxa"/>
           </w:tcPr>
-          <w:tcPr/>
           <w:p>
             <w:pPr>
               <w:pStyle w:val="Compact"/>
@@ -4085,7 +4054,6 @@
           <w:tcPr>
             <w:tcW w:w="1981" w:type="dxa"/>
           </w:tcPr>
-          <w:tcPr/>
           <w:p>
             <w:pPr>
               <w:pStyle w:val="Compact"/>
@@ -4104,7 +4072,6 @@
           <w:tcPr>
             <w:tcW w:w="3743" w:type="dxa"/>
           </w:tcPr>
-          <w:tcPr/>
           <w:p>
             <w:pPr>
               <w:pStyle w:val="Compact"/>
@@ -4135,7 +4102,6 @@
           <w:tcPr>
             <w:tcW w:w="3302" w:type="dxa"/>
           </w:tcPr>
-          <w:tcPr/>
           <w:p>
             <w:pPr>
               <w:pStyle w:val="Compact"/>
@@ -4155,7 +4121,6 @@
           <w:tcPr>
             <w:tcW w:w="1981" w:type="dxa"/>
           </w:tcPr>
-          <w:tcPr/>
           <w:p>
             <w:pPr>
               <w:pStyle w:val="Compact"/>
@@ -4174,7 +4139,6 @@
           <w:tcPr>
             <w:tcW w:w="3743" w:type="dxa"/>
           </w:tcPr>
-          <w:tcPr/>
           <w:p>
             <w:pPr>
               <w:pStyle w:val="Compact"/>
@@ -4205,7 +4169,6 @@
           <w:tcPr>
             <w:tcW w:w="3302" w:type="dxa"/>
           </w:tcPr>
-          <w:tcPr/>
           <w:p>
             <w:pPr>
               <w:pStyle w:val="Compact"/>
@@ -4225,7 +4188,6 @@
           <w:tcPr>
             <w:tcW w:w="1981" w:type="dxa"/>
           </w:tcPr>
-          <w:tcPr/>
           <w:p>
             <w:pPr>
               <w:pStyle w:val="Compact"/>
@@ -4244,7 +4206,6 @@
           <w:tcPr>
             <w:tcW w:w="3743" w:type="dxa"/>
           </w:tcPr>
-          <w:tcPr/>
           <w:p>
             <w:pPr>
               <w:pStyle w:val="Compact"/>
@@ -4275,7 +4236,6 @@
           <w:tcPr>
             <w:tcW w:w="3302" w:type="dxa"/>
           </w:tcPr>
-          <w:tcPr/>
           <w:p>
             <w:pPr>
               <w:pStyle w:val="Compact"/>
@@ -4317,7 +4277,6 @@
           <w:tcPr>
             <w:tcW w:w="1981" w:type="dxa"/>
           </w:tcPr>
-          <w:tcPr/>
           <w:p>
             <w:pPr>
               <w:pStyle w:val="Compact"/>
@@ -4336,7 +4295,6 @@
           <w:tcPr>
             <w:tcW w:w="3743" w:type="dxa"/>
           </w:tcPr>
-          <w:tcPr/>
           <w:p>
             <w:pPr>
               <w:pStyle w:val="Compact"/>
@@ -4367,7 +4325,6 @@
           <w:tcPr>
             <w:tcW w:w="3302" w:type="dxa"/>
           </w:tcPr>
-          <w:tcPr/>
           <w:p>
             <w:pPr>
               <w:pStyle w:val="Compact"/>
@@ -4386,7 +4343,6 @@
           <w:tcPr>
             <w:tcW w:w="1981" w:type="dxa"/>
           </w:tcPr>
-          <w:tcPr/>
           <w:p>
             <w:pPr>
               <w:pStyle w:val="Compact"/>
@@ -4405,7 +4361,6 @@
           <w:tcPr>
             <w:tcW w:w="3743" w:type="dxa"/>
           </w:tcPr>
-          <w:tcPr/>
           <w:p>
             <w:pPr>
               <w:pStyle w:val="Compact"/>
@@ -10074,7 +10029,6 @@
           <w:tcPr>
             <w:tcW w:w="3471" w:type="dxa"/>
           </w:tcPr>
-          <w:tcPr/>
           <w:p>
             <w:pPr>
               <w:pStyle w:val="Compact"/>
@@ -10093,7 +10047,6 @@
           <w:tcPr>
             <w:tcW w:w="5555" w:type="dxa"/>
           </w:tcPr>
-          <w:tcPr/>
           <w:p>
             <w:pPr>
               <w:pStyle w:val="Compact"/>
@@ -10114,7 +10067,6 @@
           <w:tcPr>
             <w:tcW w:w="3471" w:type="dxa"/>
           </w:tcPr>
-          <w:tcPr/>
           <w:p>
             <w:pPr>
               <w:pStyle w:val="Compact"/>
@@ -10133,7 +10085,6 @@
           <w:tcPr>
             <w:tcW w:w="5555" w:type="dxa"/>
           </w:tcPr>
-          <w:tcPr/>
           <w:p>
             <w:pPr>
               <w:pStyle w:val="Compact"/>
@@ -10171,7 +10122,6 @@
           <w:tcPr>
             <w:tcW w:w="3471" w:type="dxa"/>
           </w:tcPr>
-          <w:tcPr/>
           <w:p>
             <w:pPr>
               <w:pStyle w:val="Compact"/>
@@ -10190,7 +10140,6 @@
           <w:tcPr>
             <w:tcW w:w="5555" w:type="dxa"/>
           </w:tcPr>
-          <w:tcPr/>
           <w:p>
             <w:pPr>
               <w:pStyle w:val="Compact"/>
@@ -10330,7 +10279,6 @@
           <w:tcPr>
             <w:tcW w:w="3471" w:type="dxa"/>
           </w:tcPr>
-          <w:tcPr/>
           <w:p>
             <w:pPr>
               <w:pStyle w:val="Compact"/>
@@ -10349,7 +10297,6 @@
           <w:tcPr>
             <w:tcW w:w="5555" w:type="dxa"/>
           </w:tcPr>
-          <w:tcPr/>
           <w:p>
             <w:pPr>
               <w:pStyle w:val="Compact"/>
@@ -10394,7 +10341,6 @@
           <w:tcPr>
             <w:tcW w:w="3471" w:type="dxa"/>
           </w:tcPr>
-          <w:tcPr/>
           <w:p>
             <w:pPr>
               <w:pStyle w:val="Compact"/>
@@ -10413,7 +10359,6 @@
           <w:tcPr>
             <w:tcW w:w="5555" w:type="dxa"/>
           </w:tcPr>
-          <w:tcPr/>
           <w:p>
             <w:pPr>
               <w:pStyle w:val="Compact"/>
@@ -10434,7 +10379,6 @@
           <w:tcPr>
             <w:tcW w:w="3471" w:type="dxa"/>
           </w:tcPr>
-          <w:tcPr/>
           <w:p>
             <w:pPr>
               <w:pStyle w:val="Compact"/>
@@ -10453,7 +10397,6 @@
           <w:tcPr>
             <w:tcW w:w="5555" w:type="dxa"/>
           </w:tcPr>
-          <w:tcPr/>
           <w:p>
             <w:pPr>
               <w:pStyle w:val="Compact"/>
@@ -10474,7 +10417,6 @@
           <w:tcPr>
             <w:tcW w:w="3471" w:type="dxa"/>
           </w:tcPr>
-          <w:tcPr/>
           <w:p>
             <w:pPr>
               <w:pStyle w:val="Compact"/>
@@ -10493,7 +10435,6 @@
           <w:tcPr>
             <w:tcW w:w="5555" w:type="dxa"/>
           </w:tcPr>
-          <w:tcPr/>
           <w:p>
             <w:pPr>
               <w:pStyle w:val="Compact"/>
@@ -10547,7 +10488,6 @@
           <w:tcPr>
             <w:tcW w:w="3471" w:type="dxa"/>
           </w:tcPr>
-          <w:tcPr/>
           <w:p>
             <w:pPr>
               <w:pStyle w:val="Compact"/>
@@ -10566,7 +10506,6 @@
           <w:tcPr>
             <w:tcW w:w="5555" w:type="dxa"/>
           </w:tcPr>
-          <w:tcPr/>
           <w:p>
             <w:pPr>
               <w:pStyle w:val="Compact"/>
@@ -10587,7 +10526,6 @@
           <w:tcPr>
             <w:tcW w:w="3471" w:type="dxa"/>
           </w:tcPr>
-          <w:tcPr/>
           <w:p>
             <w:pPr>
               <w:pStyle w:val="Compact"/>
@@ -10606,7 +10544,6 @@
           <w:tcPr>
             <w:tcW w:w="5555" w:type="dxa"/>
           </w:tcPr>
-          <w:tcPr/>
           <w:p>
             <w:pPr>
               <w:pStyle w:val="Compact"/>
@@ -10693,7 +10630,6 @@
           <w:tcPr>
             <w:tcW w:w="3471" w:type="dxa"/>
           </w:tcPr>
-          <w:tcPr/>
           <w:p>
             <w:pPr>
               <w:pStyle w:val="Compact"/>
@@ -10712,7 +10648,6 @@
           <w:tcPr>
             <w:tcW w:w="5555" w:type="dxa"/>
           </w:tcPr>
-          <w:tcPr/>
           <w:p>
             <w:pPr>
               <w:pStyle w:val="Compact"/>
@@ -10733,7 +10668,6 @@
           <w:tcPr>
             <w:tcW w:w="3471" w:type="dxa"/>
           </w:tcPr>
-          <w:tcPr/>
           <w:p>
             <w:pPr>
               <w:pStyle w:val="Compact"/>
@@ -10752,7 +10686,6 @@
           <w:tcPr>
             <w:tcW w:w="5555" w:type="dxa"/>
           </w:tcPr>
-          <w:tcPr/>
           <w:p>
             <w:pPr>
               <w:pStyle w:val="Compact"/>
@@ -11893,7 +11826,6 @@
           <w:tcPr>
             <w:tcW w:w="921" w:type="dxa"/>
           </w:tcPr>
-          <w:tcPr/>
           <w:p>
             <w:pPr>
               <w:pStyle w:val="Compact"/>
@@ -11912,7 +11844,6 @@
           <w:tcPr>
             <w:tcW w:w="828" w:type="dxa"/>
           </w:tcPr>
-          <w:tcPr/>
           <w:p>
             <w:pPr>
               <w:pStyle w:val="Compact"/>
@@ -11931,7 +11862,6 @@
           <w:tcPr>
             <w:tcW w:w="1013" w:type="dxa"/>
           </w:tcPr>
-          <w:tcPr/>
           <w:p>
             <w:pPr>
               <w:pStyle w:val="Compact"/>
@@ -11950,7 +11880,6 @@
           <w:tcPr>
             <w:tcW w:w="736" w:type="dxa"/>
           </w:tcPr>
-          <w:tcPr/>
           <w:p>
             <w:pPr>
               <w:pStyle w:val="Compact"/>
@@ -11969,7 +11898,6 @@
           <w:tcPr>
             <w:tcW w:w="828" w:type="dxa"/>
           </w:tcPr>
-          <w:tcPr/>
           <w:p>
             <w:pPr>
               <w:pStyle w:val="Compact"/>
@@ -11988,7 +11916,6 @@
           <w:tcPr>
             <w:tcW w:w="736" w:type="dxa"/>
           </w:tcPr>
-          <w:tcPr/>
           <w:p>
             <w:pPr>
               <w:pStyle w:val="Compact"/>
@@ -12007,7 +11934,6 @@
           <w:tcPr>
             <w:tcW w:w="828" w:type="dxa"/>
           </w:tcPr>
-          <w:tcPr/>
           <w:p>
             <w:pPr>
               <w:pStyle w:val="Compact"/>
@@ -12026,7 +11952,6 @@
           <w:tcPr>
             <w:tcW w:w="828" w:type="dxa"/>
           </w:tcPr>
-          <w:tcPr/>
           <w:p>
             <w:pPr>
               <w:pStyle w:val="Compact"/>
@@ -12045,7 +11970,6 @@
           <w:tcPr>
             <w:tcW w:w="828" w:type="dxa"/>
           </w:tcPr>
-          <w:tcPr/>
           <w:p>
             <w:pPr>
               <w:pStyle w:val="Compact"/>
@@ -12064,7 +11988,6 @@
           <w:tcPr>
             <w:tcW w:w="828" w:type="dxa"/>
           </w:tcPr>
-          <w:tcPr/>
           <w:p>
             <w:pPr>
               <w:pStyle w:val="Compact"/>
@@ -12083,7 +12006,6 @@
           <w:tcPr>
             <w:tcW w:w="652" w:type="dxa"/>
           </w:tcPr>
-          <w:tcPr/>
           <w:p>
             <w:pPr>
               <w:pStyle w:val="Compact"/>
@@ -12104,7 +12026,6 @@
           <w:tcPr>
             <w:tcW w:w="921" w:type="dxa"/>
           </w:tcPr>
-          <w:tcPr/>
           <w:p>
             <w:pPr>
               <w:pStyle w:val="Compact"/>
@@ -12123,7 +12044,6 @@
           <w:tcPr>
             <w:tcW w:w="828" w:type="dxa"/>
           </w:tcPr>
-          <w:tcPr/>
           <w:p>
             <w:pPr>
               <w:pStyle w:val="Compact"/>
@@ -12142,7 +12062,6 @@
           <w:tcPr>
             <w:tcW w:w="1013" w:type="dxa"/>
           </w:tcPr>
-          <w:tcPr/>
           <w:p>
             <w:pPr>
               <w:pStyle w:val="Compact"/>
@@ -12161,7 +12080,6 @@
           <w:tcPr>
             <w:tcW w:w="736" w:type="dxa"/>
           </w:tcPr>
-          <w:tcPr/>
           <w:p>
             <w:pPr>
               <w:pStyle w:val="Compact"/>
@@ -12180,7 +12098,6 @@
           <w:tcPr>
             <w:tcW w:w="828" w:type="dxa"/>
           </w:tcPr>
-          <w:tcPr/>
           <w:p>
             <w:pPr>
               <w:pStyle w:val="Compact"/>
@@ -12199,7 +12116,6 @@
           <w:tcPr>
             <w:tcW w:w="736" w:type="dxa"/>
           </w:tcPr>
-          <w:tcPr/>
           <w:p>
             <w:pPr>
               <w:pStyle w:val="Compact"/>
@@ -12218,7 +12134,6 @@
           <w:tcPr>
             <w:tcW w:w="828" w:type="dxa"/>
           </w:tcPr>
-          <w:tcPr/>
           <w:p>
             <w:pPr>
               <w:pStyle w:val="Compact"/>
@@ -12237,7 +12152,6 @@
           <w:tcPr>
             <w:tcW w:w="828" w:type="dxa"/>
           </w:tcPr>
-          <w:tcPr/>
           <w:p>
             <w:pPr>
               <w:pStyle w:val="Compact"/>
@@ -12256,7 +12170,6 @@
           <w:tcPr>
             <w:tcW w:w="828" w:type="dxa"/>
           </w:tcPr>
-          <w:tcPr/>
           <w:p>
             <w:pPr>
               <w:pStyle w:val="Compact"/>
@@ -12275,7 +12188,6 @@
           <w:tcPr>
             <w:tcW w:w="828" w:type="dxa"/>
           </w:tcPr>
-          <w:tcPr/>
           <w:p>
             <w:pPr>
               <w:pStyle w:val="Compact"/>
@@ -12294,7 +12206,6 @@
           <w:tcPr>
             <w:tcW w:w="652" w:type="dxa"/>
           </w:tcPr>
-          <w:tcPr/>
           <w:p>
             <w:pPr>
               <w:pStyle w:val="Compact"/>
@@ -12315,7 +12226,6 @@
           <w:tcPr>
             <w:tcW w:w="921" w:type="dxa"/>
           </w:tcPr>
-          <w:tcPr/>
           <w:p>
             <w:pPr>
               <w:pStyle w:val="Compact"/>
@@ -12334,7 +12244,6 @@
           <w:tcPr>
             <w:tcW w:w="828" w:type="dxa"/>
           </w:tcPr>
-          <w:tcPr/>
           <w:p>
             <w:pPr>
               <w:pStyle w:val="Compact"/>
@@ -12353,7 +12262,6 @@
           <w:tcPr>
             <w:tcW w:w="1013" w:type="dxa"/>
           </w:tcPr>
-          <w:tcPr/>
           <w:p>
             <w:pPr>
               <w:pStyle w:val="Compact"/>
@@ -12372,7 +12280,6 @@
           <w:tcPr>
             <w:tcW w:w="736" w:type="dxa"/>
           </w:tcPr>
-          <w:tcPr/>
           <w:p>
             <w:pPr>
               <w:pStyle w:val="Compact"/>
@@ -12391,7 +12298,6 @@
           <w:tcPr>
             <w:tcW w:w="828" w:type="dxa"/>
           </w:tcPr>
-          <w:tcPr/>
           <w:p>
             <w:pPr>
               <w:pStyle w:val="Compact"/>
@@ -12410,7 +12316,6 @@
           <w:tcPr>
             <w:tcW w:w="736" w:type="dxa"/>
           </w:tcPr>
-          <w:tcPr/>
           <w:p>
             <w:pPr>
               <w:pStyle w:val="Compact"/>
@@ -12429,7 +12334,6 @@
           <w:tcPr>
             <w:tcW w:w="828" w:type="dxa"/>
           </w:tcPr>
-          <w:tcPr/>
           <w:p>
             <w:pPr>
               <w:pStyle w:val="Compact"/>
@@ -12448,7 +12352,6 @@
           <w:tcPr>
             <w:tcW w:w="828" w:type="dxa"/>
           </w:tcPr>
-          <w:tcPr/>
           <w:p>
             <w:pPr>
               <w:pStyle w:val="Compact"/>
@@ -12467,7 +12370,6 @@
           <w:tcPr>
             <w:tcW w:w="828" w:type="dxa"/>
           </w:tcPr>
-          <w:tcPr/>
           <w:p>
             <w:pPr>
               <w:pStyle w:val="Compact"/>
@@ -12486,7 +12388,6 @@
           <w:tcPr>
             <w:tcW w:w="828" w:type="dxa"/>
           </w:tcPr>
-          <w:tcPr/>
           <w:p>
             <w:pPr>
               <w:pStyle w:val="Compact"/>
@@ -12505,7 +12406,6 @@
           <w:tcPr>
             <w:tcW w:w="652" w:type="dxa"/>
           </w:tcPr>
-          <w:tcPr/>
           <w:p>
             <w:pPr>
               <w:pStyle w:val="Compact"/>
@@ -12526,7 +12426,6 @@
           <w:tcPr>
             <w:tcW w:w="921" w:type="dxa"/>
           </w:tcPr>
-          <w:tcPr/>
           <w:p>
             <w:pPr>
               <w:pStyle w:val="Compact"/>
@@ -12545,7 +12444,6 @@
           <w:tcPr>
             <w:tcW w:w="828" w:type="dxa"/>
           </w:tcPr>
-          <w:tcPr/>
           <w:p>
             <w:pPr>
               <w:pStyle w:val="Compact"/>
@@ -12564,7 +12462,6 @@
           <w:tcPr>
             <w:tcW w:w="1013" w:type="dxa"/>
           </w:tcPr>
-          <w:tcPr/>
           <w:p>
             <w:pPr>
               <w:pStyle w:val="Compact"/>
@@ -12583,7 +12480,6 @@
           <w:tcPr>
             <w:tcW w:w="736" w:type="dxa"/>
           </w:tcPr>
-          <w:tcPr/>
           <w:p>
             <w:pPr>
               <w:pStyle w:val="Compact"/>
@@ -12602,7 +12498,6 @@
           <w:tcPr>
             <w:tcW w:w="828" w:type="dxa"/>
           </w:tcPr>
-          <w:tcPr/>
           <w:p>
             <w:pPr>
               <w:pStyle w:val="Compact"/>
@@ -12621,7 +12516,6 @@
           <w:tcPr>
             <w:tcW w:w="736" w:type="dxa"/>
           </w:tcPr>
-          <w:tcPr/>
           <w:p>
             <w:pPr>
               <w:pStyle w:val="Compact"/>
@@ -12640,7 +12534,6 @@
           <w:tcPr>
             <w:tcW w:w="828" w:type="dxa"/>
           </w:tcPr>
-          <w:tcPr/>
           <w:p>
             <w:pPr>
               <w:pStyle w:val="Compact"/>
@@ -12659,7 +12552,6 @@
           <w:tcPr>
             <w:tcW w:w="828" w:type="dxa"/>
           </w:tcPr>
-          <w:tcPr/>
           <w:p>
             <w:pPr>
               <w:pStyle w:val="Compact"/>
@@ -12678,7 +12570,6 @@
           <w:tcPr>
             <w:tcW w:w="828" w:type="dxa"/>
           </w:tcPr>
-          <w:tcPr/>
           <w:p>
             <w:pPr>
               <w:pStyle w:val="Compact"/>
@@ -12697,7 +12588,6 @@
           <w:tcPr>
             <w:tcW w:w="828" w:type="dxa"/>
           </w:tcPr>
-          <w:tcPr/>
           <w:p>
             <w:pPr>
               <w:pStyle w:val="Compact"/>
@@ -12716,7 +12606,6 @@
           <w:tcPr>
             <w:tcW w:w="652" w:type="dxa"/>
           </w:tcPr>
-          <w:tcPr/>
           <w:p>
             <w:pPr>
               <w:pStyle w:val="Compact"/>
@@ -12737,7 +12626,6 @@
           <w:tcPr>
             <w:tcW w:w="921" w:type="dxa"/>
           </w:tcPr>
-          <w:tcPr/>
           <w:p>
             <w:pPr>
               <w:pStyle w:val="Compact"/>
@@ -12756,7 +12644,6 @@
           <w:tcPr>
             <w:tcW w:w="828" w:type="dxa"/>
           </w:tcPr>
-          <w:tcPr/>
           <w:p>
             <w:pPr>
               <w:pStyle w:val="Compact"/>
@@ -12775,7 +12662,6 @@
           <w:tcPr>
             <w:tcW w:w="1013" w:type="dxa"/>
           </w:tcPr>
-          <w:tcPr/>
           <w:p>
             <w:pPr>
               <w:pStyle w:val="Compact"/>
@@ -12794,7 +12680,6 @@
           <w:tcPr>
             <w:tcW w:w="736" w:type="dxa"/>
           </w:tcPr>
-          <w:tcPr/>
           <w:p>
             <w:pPr>
               <w:pStyle w:val="Compact"/>
@@ -12813,7 +12698,6 @@
           <w:tcPr>
             <w:tcW w:w="828" w:type="dxa"/>
           </w:tcPr>
-          <w:tcPr/>
           <w:p>
             <w:pPr>
               <w:pStyle w:val="Compact"/>
@@ -12832,7 +12716,6 @@
           <w:tcPr>
             <w:tcW w:w="736" w:type="dxa"/>
           </w:tcPr>
-          <w:tcPr/>
           <w:p>
             <w:pPr>
               <w:pStyle w:val="Compact"/>
@@ -12851,7 +12734,6 @@
           <w:tcPr>
             <w:tcW w:w="828" w:type="dxa"/>
           </w:tcPr>
-          <w:tcPr/>
           <w:p>
             <w:pPr>
               <w:pStyle w:val="Compact"/>
@@ -12870,7 +12752,6 @@
           <w:tcPr>
             <w:tcW w:w="828" w:type="dxa"/>
           </w:tcPr>
-          <w:tcPr/>
           <w:p>
             <w:pPr>
               <w:pStyle w:val="Compact"/>
@@ -12889,7 +12770,6 @@
           <w:tcPr>
             <w:tcW w:w="828" w:type="dxa"/>
           </w:tcPr>
-          <w:tcPr/>
           <w:p>
             <w:pPr>
               <w:pStyle w:val="Compact"/>
@@ -12908,7 +12788,6 @@
           <w:tcPr>
             <w:tcW w:w="828" w:type="dxa"/>
           </w:tcPr>
-          <w:tcPr/>
           <w:p>
             <w:pPr>
               <w:pStyle w:val="Compact"/>
@@ -12927,7 +12806,6 @@
           <w:tcPr>
             <w:tcW w:w="652" w:type="dxa"/>
           </w:tcPr>
-          <w:tcPr/>
           <w:p>
             <w:pPr>
               <w:pStyle w:val="Compact"/>
@@ -12948,7 +12826,6 @@
           <w:tcPr>
             <w:tcW w:w="921" w:type="dxa"/>
           </w:tcPr>
-          <w:tcPr/>
           <w:p>
             <w:pPr>
               <w:pStyle w:val="Compact"/>
@@ -12967,7 +12844,6 @@
           <w:tcPr>
             <w:tcW w:w="828" w:type="dxa"/>
           </w:tcPr>
-          <w:tcPr/>
           <w:p>
             <w:pPr>
               <w:pStyle w:val="Compact"/>
@@ -12986,7 +12862,6 @@
           <w:tcPr>
             <w:tcW w:w="1013" w:type="dxa"/>
           </w:tcPr>
-          <w:tcPr/>
           <w:p>
             <w:pPr>
               <w:pStyle w:val="Compact"/>
@@ -13005,7 +12880,6 @@
           <w:tcPr>
             <w:tcW w:w="736" w:type="dxa"/>
           </w:tcPr>
-          <w:tcPr/>
           <w:p>
             <w:pPr>
               <w:pStyle w:val="Compact"/>
@@ -13024,7 +12898,6 @@
           <w:tcPr>
             <w:tcW w:w="828" w:type="dxa"/>
           </w:tcPr>
-          <w:tcPr/>
           <w:p>
             <w:pPr>
               <w:pStyle w:val="Compact"/>
@@ -13043,7 +12916,6 @@
           <w:tcPr>
             <w:tcW w:w="736" w:type="dxa"/>
           </w:tcPr>
-          <w:tcPr/>
           <w:p>
             <w:pPr>
               <w:pStyle w:val="Compact"/>
@@ -13062,7 +12934,6 @@
           <w:tcPr>
             <w:tcW w:w="828" w:type="dxa"/>
           </w:tcPr>
-          <w:tcPr/>
           <w:p>
             <w:pPr>
               <w:pStyle w:val="Compact"/>
@@ -13081,7 +12952,6 @@
           <w:tcPr>
             <w:tcW w:w="828" w:type="dxa"/>
           </w:tcPr>
-          <w:tcPr/>
           <w:p>
             <w:pPr>
               <w:pStyle w:val="Compact"/>
@@ -13100,7 +12970,6 @@
           <w:tcPr>
             <w:tcW w:w="828" w:type="dxa"/>
           </w:tcPr>
-          <w:tcPr/>
           <w:p>
             <w:pPr>
               <w:pStyle w:val="Compact"/>
@@ -13119,7 +12988,6 @@
           <w:tcPr>
             <w:tcW w:w="828" w:type="dxa"/>
           </w:tcPr>
-          <w:tcPr/>
           <w:p>
             <w:pPr>
               <w:pStyle w:val="Compact"/>
@@ -13138,7 +13006,6 @@
           <w:tcPr>
             <w:tcW w:w="652" w:type="dxa"/>
           </w:tcPr>
-          <w:tcPr/>
           <w:p>
             <w:pPr>
               <w:pStyle w:val="Compact"/>
@@ -13159,7 +13026,6 @@
           <w:tcPr>
             <w:tcW w:w="921" w:type="dxa"/>
           </w:tcPr>
-          <w:tcPr/>
           <w:p>
             <w:pPr>
               <w:pStyle w:val="Compact"/>
@@ -13219,7 +13085,6 @@
           <w:tcPr>
             <w:tcW w:w="828" w:type="dxa"/>
           </w:tcPr>
-          <w:tcPr/>
           <w:p>
             <w:pPr>
               <w:pStyle w:val="Compact"/>
@@ -13238,7 +13103,6 @@
           <w:tcPr>
             <w:tcW w:w="1013" w:type="dxa"/>
           </w:tcPr>
-          <w:tcPr/>
           <w:p>
             <w:pPr>
               <w:pStyle w:val="Compact"/>
@@ -13259,7 +13123,6 @@
           <w:tcPr>
             <w:tcW w:w="736" w:type="dxa"/>
           </w:tcPr>
-          <w:tcPr/>
           <w:p>
             <w:pPr>
               <w:pStyle w:val="Compact"/>
@@ -13280,7 +13143,6 @@
           <w:tcPr>
             <w:tcW w:w="828" w:type="dxa"/>
           </w:tcPr>
-          <w:tcPr/>
           <w:p>
             <w:pPr>
               <w:pStyle w:val="Compact"/>
@@ -13301,7 +13163,6 @@
           <w:tcPr>
             <w:tcW w:w="736" w:type="dxa"/>
           </w:tcPr>
-          <w:tcPr/>
           <w:p>
             <w:pPr>
               <w:pStyle w:val="Compact"/>
@@ -13322,7 +13183,6 @@
           <w:tcPr>
             <w:tcW w:w="828" w:type="dxa"/>
           </w:tcPr>
-          <w:tcPr/>
           <w:p>
             <w:pPr>
               <w:pStyle w:val="Compact"/>
@@ -13343,7 +13203,6 @@
           <w:tcPr>
             <w:tcW w:w="828" w:type="dxa"/>
           </w:tcPr>
-          <w:tcPr/>
           <w:p>
             <w:pPr>
               <w:pStyle w:val="Compact"/>
@@ -13364,7 +13223,6 @@
           <w:tcPr>
             <w:tcW w:w="828" w:type="dxa"/>
           </w:tcPr>
-          <w:tcPr/>
           <w:p>
             <w:pPr>
               <w:pStyle w:val="Compact"/>
@@ -13385,7 +13243,6 @@
           <w:tcPr>
             <w:tcW w:w="828" w:type="dxa"/>
           </w:tcPr>
-          <w:tcPr/>
           <w:p>
             <w:pPr>
               <w:pStyle w:val="Compact"/>
@@ -13404,7 +13261,6 @@
           <w:tcPr>
             <w:tcW w:w="652" w:type="dxa"/>
           </w:tcPr>
-          <w:tcPr/>
           <w:p>
             <w:pPr>
               <w:pStyle w:val="Compact"/>
@@ -13515,7 +13371,6 @@
           <w:tcPr>
             <w:tcW w:w="2133" w:type="dxa"/>
           </w:tcPr>
-          <w:tcPr/>
           <w:p>
             <w:pPr>
               <w:pStyle w:val="Compact"/>
@@ -13534,7 +13389,6 @@
           <w:tcPr>
             <w:tcW w:w="1641" w:type="dxa"/>
           </w:tcPr>
-          <w:tcPr/>
           <w:p>
             <w:pPr>
               <w:pStyle w:val="Compact"/>
@@ -13553,7 +13407,6 @@
           <w:tcPr>
             <w:tcW w:w="1312" w:type="dxa"/>
           </w:tcPr>
-          <w:tcPr/>
           <w:p>
             <w:pPr>
               <w:pStyle w:val="Compact"/>
@@ -13572,7 +13425,6 @@
           <w:tcPr>
             <w:tcW w:w="1312" w:type="dxa"/>
           </w:tcPr>
-          <w:tcPr/>
           <w:p>
             <w:pPr>
               <w:pStyle w:val="Compact"/>
@@ -13591,7 +13443,6 @@
           <w:tcPr>
             <w:tcW w:w="1312" w:type="dxa"/>
           </w:tcPr>
-          <w:tcPr/>
           <w:p>
             <w:pPr>
               <w:pStyle w:val="Compact"/>
@@ -13610,7 +13461,6 @@
           <w:tcPr>
             <w:tcW w:w="1316" w:type="dxa"/>
           </w:tcPr>
-          <w:tcPr/>
           <w:p>
             <w:pPr>
               <w:pStyle w:val="Compact"/>
@@ -13631,7 +13481,6 @@
           <w:tcPr>
             <w:tcW w:w="2133" w:type="dxa"/>
           </w:tcPr>
-          <w:tcPr/>
           <w:p>
             <w:pPr>
               <w:pStyle w:val="Compact"/>
@@ -13650,7 +13499,6 @@
           <w:tcPr>
             <w:tcW w:w="1641" w:type="dxa"/>
           </w:tcPr>
-          <w:tcPr/>
           <w:p>
             <w:pPr>
               <w:pStyle w:val="Compact"/>
@@ -13669,7 +13517,6 @@
           <w:tcPr>
             <w:tcW w:w="1312" w:type="dxa"/>
           </w:tcPr>
-          <w:tcPr/>
           <w:p>
             <w:pPr>
               <w:pStyle w:val="Compact"/>
@@ -13688,7 +13535,6 @@
           <w:tcPr>
             <w:tcW w:w="1312" w:type="dxa"/>
           </w:tcPr>
-          <w:tcPr/>
           <w:p>
             <w:pPr>
               <w:pStyle w:val="Compact"/>
@@ -13707,7 +13553,6 @@
           <w:tcPr>
             <w:tcW w:w="1312" w:type="dxa"/>
           </w:tcPr>
-          <w:tcPr/>
           <w:p>
             <w:pPr>
               <w:pStyle w:val="Compact"/>
@@ -13726,7 +13571,6 @@
           <w:tcPr>
             <w:tcW w:w="1316" w:type="dxa"/>
           </w:tcPr>
-          <w:tcPr/>
           <w:p>
             <w:pPr>
               <w:pStyle w:val="Compact"/>
@@ -13747,7 +13591,6 @@
           <w:tcPr>
             <w:tcW w:w="2133" w:type="dxa"/>
           </w:tcPr>
-          <w:tcPr/>
           <w:p>
             <w:pPr>
               <w:pStyle w:val="Compact"/>
@@ -13766,7 +13609,6 @@
           <w:tcPr>
             <w:tcW w:w="1641" w:type="dxa"/>
           </w:tcPr>
-          <w:tcPr/>
           <w:p>
             <w:pPr>
               <w:pStyle w:val="Compact"/>
@@ -13785,7 +13627,6 @@
           <w:tcPr>
             <w:tcW w:w="1312" w:type="dxa"/>
           </w:tcPr>
-          <w:tcPr/>
           <w:p>
             <w:pPr>
               <w:pStyle w:val="Compact"/>
@@ -13804,7 +13645,6 @@
           <w:tcPr>
             <w:tcW w:w="1312" w:type="dxa"/>
           </w:tcPr>
-          <w:tcPr/>
           <w:p>
             <w:pPr>
               <w:pStyle w:val="Compact"/>
@@ -13823,7 +13663,6 @@
           <w:tcPr>
             <w:tcW w:w="1312" w:type="dxa"/>
           </w:tcPr>
-          <w:tcPr/>
           <w:p>
             <w:pPr>
               <w:pStyle w:val="Compact"/>
@@ -13842,7 +13681,6 @@
           <w:tcPr>
             <w:tcW w:w="1316" w:type="dxa"/>
           </w:tcPr>
-          <w:tcPr/>
           <w:p>
             <w:pPr>
               <w:pStyle w:val="Compact"/>
@@ -13863,7 +13701,6 @@
           <w:tcPr>
             <w:tcW w:w="2133" w:type="dxa"/>
           </w:tcPr>
-          <w:tcPr/>
           <w:p>
             <w:pPr>
               <w:pStyle w:val="Compact"/>
@@ -13882,7 +13719,6 @@
           <w:tcPr>
             <w:tcW w:w="1641" w:type="dxa"/>
           </w:tcPr>
-          <w:tcPr/>
           <w:p>
             <w:pPr>
               <w:pStyle w:val="Compact"/>
@@ -13901,7 +13737,6 @@
           <w:tcPr>
             <w:tcW w:w="1312" w:type="dxa"/>
           </w:tcPr>
-          <w:tcPr/>
           <w:p>
             <w:pPr>
               <w:pStyle w:val="Compact"/>
@@ -13920,7 +13755,6 @@
           <w:tcPr>
             <w:tcW w:w="1312" w:type="dxa"/>
           </w:tcPr>
-          <w:tcPr/>
           <w:p>
             <w:pPr>
               <w:pStyle w:val="Compact"/>
@@ -13939,7 +13773,6 @@
           <w:tcPr>
             <w:tcW w:w="1312" w:type="dxa"/>
           </w:tcPr>
-          <w:tcPr/>
           <w:p>
             <w:pPr>
               <w:pStyle w:val="Compact"/>
@@ -13958,7 +13791,6 @@
           <w:tcPr>
             <w:tcW w:w="1316" w:type="dxa"/>
           </w:tcPr>
-          <w:tcPr/>
           <w:p>
             <w:pPr>
               <w:pStyle w:val="Compact"/>
@@ -13979,7 +13811,6 @@
           <w:tcPr>
             <w:tcW w:w="2133" w:type="dxa"/>
           </w:tcPr>
-          <w:tcPr/>
           <w:p>
             <w:pPr>
               <w:pStyle w:val="Compact"/>
@@ -13998,7 +13829,6 @@
           <w:tcPr>
             <w:tcW w:w="1641" w:type="dxa"/>
           </w:tcPr>
-          <w:tcPr/>
           <w:p>
             <w:pPr>
               <w:pStyle w:val="Compact"/>
@@ -14017,7 +13847,6 @@
           <w:tcPr>
             <w:tcW w:w="1312" w:type="dxa"/>
           </w:tcPr>
-          <w:tcPr/>
           <w:p>
             <w:pPr>
               <w:pStyle w:val="Compact"/>
@@ -14036,7 +13865,6 @@
           <w:tcPr>
             <w:tcW w:w="1312" w:type="dxa"/>
           </w:tcPr>
-          <w:tcPr/>
           <w:p>
             <w:pPr>
               <w:pStyle w:val="Compact"/>
@@ -14055,7 +13883,6 @@
           <w:tcPr>
             <w:tcW w:w="1312" w:type="dxa"/>
           </w:tcPr>
-          <w:tcPr/>
           <w:p>
             <w:pPr>
               <w:pStyle w:val="Compact"/>
@@ -14074,7 +13901,6 @@
           <w:tcPr>
             <w:tcW w:w="1316" w:type="dxa"/>
           </w:tcPr>
-          <w:tcPr/>
           <w:p>
             <w:pPr>
               <w:pStyle w:val="Compact"/>
@@ -14340,7 +14166,6 @@
           <w:tcPr>
             <w:tcW w:w="4813" w:type="dxa"/>
           </w:tcPr>
-          <w:tcPr/>
           <w:p>
             <w:pPr>
               <w:pStyle w:val="Compact"/>
@@ -14359,7 +14184,6 @@
           <w:tcPr>
             <w:tcW w:w="2607" w:type="dxa"/>
           </w:tcPr>
-          <w:tcPr/>
           <w:p>
             <w:pPr>
               <w:pStyle w:val="Compact"/>
@@ -14378,7 +14202,6 @@
           <w:tcPr>
             <w:tcW w:w="1606" w:type="dxa"/>
           </w:tcPr>
-          <w:tcPr/>
           <w:p>
             <w:pPr>
               <w:pStyle w:val="Compact"/>
@@ -14399,7 +14222,6 @@
           <w:tcPr>
             <w:tcW w:w="4813" w:type="dxa"/>
           </w:tcPr>
-          <w:tcPr/>
           <w:p>
             <w:pPr>
               <w:pStyle w:val="Compact"/>
@@ -14418,7 +14240,6 @@
           <w:tcPr>
             <w:tcW w:w="2607" w:type="dxa"/>
           </w:tcPr>
-          <w:tcPr/>
           <w:p>
             <w:pPr>
               <w:pStyle w:val="Compact"/>
@@ -14437,7 +14258,6 @@
           <w:tcPr>
             <w:tcW w:w="1606" w:type="dxa"/>
           </w:tcPr>
-          <w:tcPr/>
           <w:p>
             <w:pPr>
               <w:pStyle w:val="Compact"/>
@@ -14458,7 +14278,6 @@
           <w:tcPr>
             <w:tcW w:w="4813" w:type="dxa"/>
           </w:tcPr>
-          <w:tcPr/>
           <w:p>
             <w:pPr>
               <w:pStyle w:val="Compact"/>
@@ -14477,7 +14296,6 @@
           <w:tcPr>
             <w:tcW w:w="2607" w:type="dxa"/>
           </w:tcPr>
-          <w:tcPr/>
           <w:p>
             <w:pPr>
               <w:pStyle w:val="Compact"/>
@@ -14496,7 +14314,6 @@
           <w:tcPr>
             <w:tcW w:w="1606" w:type="dxa"/>
           </w:tcPr>
-          <w:tcPr/>
           <w:p>
             <w:pPr>
               <w:pStyle w:val="Compact"/>
@@ -14517,7 +14334,6 @@
           <w:tcPr>
             <w:tcW w:w="4813" w:type="dxa"/>
           </w:tcPr>
-          <w:tcPr/>
           <w:p>
             <w:pPr>
               <w:pStyle w:val="Compact"/>
@@ -14536,7 +14352,6 @@
           <w:tcPr>
             <w:tcW w:w="2607" w:type="dxa"/>
           </w:tcPr>
-          <w:tcPr/>
           <w:p>
             <w:pPr>
               <w:pStyle w:val="Compact"/>
@@ -14555,7 +14370,6 @@
           <w:tcPr>
             <w:tcW w:w="1606" w:type="dxa"/>
           </w:tcPr>
-          <w:tcPr/>
           <w:p>
             <w:pPr>
               <w:pStyle w:val="Compact"/>
@@ -14576,7 +14390,6 @@
           <w:tcPr>
             <w:tcW w:w="4813" w:type="dxa"/>
           </w:tcPr>
-          <w:tcPr/>
           <w:p>
             <w:pPr>
               <w:pStyle w:val="Compact"/>
@@ -14595,7 +14408,6 @@
           <w:tcPr>
             <w:tcW w:w="2607" w:type="dxa"/>
           </w:tcPr>
-          <w:tcPr/>
           <w:p>
             <w:pPr>
               <w:pStyle w:val="Compact"/>
@@ -14614,7 +14426,6 @@
           <w:tcPr>
             <w:tcW w:w="1606" w:type="dxa"/>
           </w:tcPr>
-          <w:tcPr/>
           <w:p>
             <w:pPr>
               <w:pStyle w:val="Compact"/>
@@ -14635,7 +14446,6 @@
           <w:tcPr>
             <w:tcW w:w="4813" w:type="dxa"/>
           </w:tcPr>
-          <w:tcPr/>
           <w:p>
             <w:pPr>
               <w:pStyle w:val="Compact"/>
@@ -14654,7 +14464,6 @@
           <w:tcPr>
             <w:tcW w:w="2607" w:type="dxa"/>
           </w:tcPr>
-          <w:tcPr/>
           <w:p>
             <w:pPr>
               <w:pStyle w:val="Compact"/>
@@ -14673,7 +14482,6 @@
           <w:tcPr>
             <w:tcW w:w="1606" w:type="dxa"/>
           </w:tcPr>
-          <w:tcPr/>
           <w:p>
             <w:pPr>
               <w:pStyle w:val="Compact"/>
@@ -14694,7 +14502,6 @@
           <w:tcPr>
             <w:tcW w:w="4813" w:type="dxa"/>
           </w:tcPr>
-          <w:tcPr/>
           <w:p>
             <w:pPr>
               <w:pStyle w:val="Compact"/>
@@ -14713,7 +14520,6 @@
           <w:tcPr>
             <w:tcW w:w="2607" w:type="dxa"/>
           </w:tcPr>
-          <w:tcPr/>
           <w:p>
             <w:pPr>
               <w:pStyle w:val="Compact"/>
@@ -14732,7 +14538,6 @@
           <w:tcPr>
             <w:tcW w:w="1606" w:type="dxa"/>
           </w:tcPr>
-          <w:tcPr/>
           <w:p>
             <w:pPr>
               <w:pStyle w:val="Compact"/>
@@ -14753,7 +14558,6 @@
           <w:tcPr>
             <w:tcW w:w="4813" w:type="dxa"/>
           </w:tcPr>
-          <w:tcPr/>
           <w:p>
             <w:pPr>
               <w:pStyle w:val="Compact"/>
@@ -14788,7 +14592,6 @@
           <w:tcPr>
             <w:tcW w:w="2607" w:type="dxa"/>
           </w:tcPr>
-          <w:tcPr/>
           <w:p>
             <w:pPr>
               <w:pStyle w:val="Compact"/>
@@ -14807,7 +14610,6 @@
           <w:tcPr>
             <w:tcW w:w="1606" w:type="dxa"/>
           </w:tcPr>
-          <w:tcPr/>
           <w:p>
             <w:pPr>
               <w:pStyle w:val="Compact"/>
@@ -14828,7 +14630,6 @@
           <w:tcPr>
             <w:tcW w:w="4813" w:type="dxa"/>
           </w:tcPr>
-          <w:tcPr/>
           <w:p>
             <w:pPr>
               <w:pStyle w:val="Compact"/>
@@ -14849,7 +14650,6 @@
           <w:tcPr>
             <w:tcW w:w="2607" w:type="dxa"/>
           </w:tcPr>
-          <w:tcPr/>
           <w:p>
             <w:pPr>
               <w:pStyle w:val="Compact"/>
@@ -14870,7 +14670,6 @@
           <w:tcPr>
             <w:tcW w:w="1606" w:type="dxa"/>
           </w:tcPr>
-          <w:tcPr/>
           <w:p>
             <w:pPr>
               <w:pStyle w:val="Compact"/>
@@ -15585,7 +15384,6 @@
           <w:tcPr>
             <w:tcW w:w="2221" w:type="dxa"/>
           </w:tcPr>
-          <w:tcPr/>
           <w:p>
             <w:pPr>
               <w:pStyle w:val="Compact"/>
@@ -15604,7 +15402,6 @@
           <w:tcPr>
             <w:tcW w:w="1527" w:type="dxa"/>
           </w:tcPr>
-          <w:tcPr/>
           <w:p>
             <w:pPr>
               <w:pStyle w:val="Compact"/>
@@ -15623,7 +15420,6 @@
           <w:tcPr>
             <w:tcW w:w="1527" w:type="dxa"/>
           </w:tcPr>
-          <w:tcPr/>
           <w:p>
             <w:pPr>
               <w:pStyle w:val="Compact"/>
@@ -15642,7 +15438,6 @@
           <w:tcPr>
             <w:tcW w:w="1110" w:type="dxa"/>
           </w:tcPr>
-          <w:tcPr/>
           <w:p>
             <w:pPr>
               <w:pStyle w:val="Compact"/>
@@ -15661,7 +15456,6 @@
           <w:tcPr>
             <w:tcW w:w="2641" w:type="dxa"/>
           </w:tcPr>
-          <w:tcPr/>
           <w:p>
             <w:pPr>
               <w:pStyle w:val="Compact"/>
@@ -15712,7 +15506,6 @@
           <w:tcPr>
             <w:tcW w:w="2221" w:type="dxa"/>
           </w:tcPr>
-          <w:tcPr/>
           <w:p>
             <w:pPr>
               <w:pStyle w:val="Compact"/>
@@ -15731,7 +15524,6 @@
           <w:tcPr>
             <w:tcW w:w="1527" w:type="dxa"/>
           </w:tcPr>
-          <w:tcPr/>
           <w:p>
             <w:pPr>
               <w:pStyle w:val="Compact"/>
@@ -15750,7 +15542,6 @@
           <w:tcPr>
             <w:tcW w:w="1527" w:type="dxa"/>
           </w:tcPr>
-          <w:tcPr/>
           <w:p>
             <w:pPr>
               <w:pStyle w:val="Compact"/>
@@ -15769,7 +15560,6 @@
           <w:tcPr>
             <w:tcW w:w="1110" w:type="dxa"/>
           </w:tcPr>
-          <w:tcPr/>
           <w:p>
             <w:pPr>
               <w:pStyle w:val="Compact"/>
@@ -15788,7 +15578,6 @@
           <w:tcPr>
             <w:tcW w:w="2641" w:type="dxa"/>
           </w:tcPr>
-          <w:tcPr/>
           <w:p>
             <w:pPr>
               <w:pStyle w:val="Compact"/>
@@ -15809,7 +15598,6 @@
           <w:tcPr>
             <w:tcW w:w="2221" w:type="dxa"/>
           </w:tcPr>
-          <w:tcPr/>
           <w:p>
             <w:pPr>
               <w:pStyle w:val="Compact"/>
@@ -15828,7 +15616,6 @@
           <w:tcPr>
             <w:tcW w:w="1527" w:type="dxa"/>
           </w:tcPr>
-          <w:tcPr/>
           <w:p>
             <w:pPr>
               <w:pStyle w:val="Compact"/>
@@ -15847,7 +15634,6 @@
           <w:tcPr>
             <w:tcW w:w="1527" w:type="dxa"/>
           </w:tcPr>
-          <w:tcPr/>
           <w:p>
             <w:pPr>
               <w:pStyle w:val="Compact"/>
@@ -15866,7 +15652,6 @@
           <w:tcPr>
             <w:tcW w:w="1110" w:type="dxa"/>
           </w:tcPr>
-          <w:tcPr/>
           <w:p>
             <w:pPr>
               <w:pStyle w:val="Compact"/>
@@ -15885,7 +15670,6 @@
           <w:tcPr>
             <w:tcW w:w="2641" w:type="dxa"/>
           </w:tcPr>
-          <w:tcPr/>
           <w:p>
             <w:pPr>
               <w:pStyle w:val="Compact"/>
@@ -15914,7 +15698,6 @@
           <w:tcPr>
             <w:tcW w:w="2221" w:type="dxa"/>
           </w:tcPr>
-          <w:tcPr/>
           <w:p>
             <w:pPr>
               <w:pStyle w:val="Compact"/>
@@ -15933,7 +15716,6 @@
           <w:tcPr>
             <w:tcW w:w="1527" w:type="dxa"/>
           </w:tcPr>
-          <w:tcPr/>
           <w:p>
             <w:pPr>
               <w:pStyle w:val="Compact"/>
@@ -15952,7 +15734,6 @@
           <w:tcPr>
             <w:tcW w:w="1527" w:type="dxa"/>
           </w:tcPr>
-          <w:tcPr/>
           <w:p>
             <w:pPr>
               <w:pStyle w:val="Compact"/>
@@ -15971,7 +15752,6 @@
           <w:tcPr>
             <w:tcW w:w="1110" w:type="dxa"/>
           </w:tcPr>
-          <w:tcPr/>
           <w:p>
             <w:pPr>
               <w:pStyle w:val="Compact"/>
@@ -15990,7 +15770,6 @@
           <w:tcPr>
             <w:tcW w:w="2641" w:type="dxa"/>
           </w:tcPr>
-          <w:tcPr/>
           <w:p>
             <w:pPr>
               <w:pStyle w:val="Compact"/>
@@ -16011,7 +15790,6 @@
           <w:tcPr>
             <w:tcW w:w="2221" w:type="dxa"/>
           </w:tcPr>
-          <w:tcPr/>
           <w:p>
             <w:pPr>
               <w:pStyle w:val="Compact"/>
@@ -16030,7 +15808,6 @@
           <w:tcPr>
             <w:tcW w:w="1527" w:type="dxa"/>
           </w:tcPr>
-          <w:tcPr/>
           <w:p>
             <w:pPr>
               <w:pStyle w:val="Compact"/>
@@ -16049,7 +15826,6 @@
           <w:tcPr>
             <w:tcW w:w="1527" w:type="dxa"/>
           </w:tcPr>
-          <w:tcPr/>
           <w:p>
             <w:pPr>
               <w:pStyle w:val="Compact"/>
@@ -16068,7 +15844,6 @@
           <w:tcPr>
             <w:tcW w:w="1110" w:type="dxa"/>
           </w:tcPr>
-          <w:tcPr/>
           <w:p>
             <w:pPr>
               <w:pStyle w:val="Compact"/>
@@ -16087,7 +15862,6 @@
           <w:tcPr>
             <w:tcW w:w="2641" w:type="dxa"/>
           </w:tcPr>
-          <w:tcPr/>
           <w:p>
             <w:pPr>
               <w:pStyle w:val="Compact"/>
@@ -16358,7 +16132,6 @@
           <w:tcPr>
             <w:tcW w:w="3868" w:type="dxa"/>
           </w:tcPr>
-          <w:tcPr/>
           <w:p>
             <w:pPr>
               <w:pStyle w:val="Compact"/>
@@ -16377,7 +16150,6 @@
           <w:tcPr>
             <w:tcW w:w="2256" w:type="dxa"/>
           </w:tcPr>
-          <w:tcPr/>
           <w:p>
             <w:pPr>
               <w:pStyle w:val="Compact"/>
@@ -16396,7 +16168,6 @@
           <w:tcPr>
             <w:tcW w:w="2902" w:type="dxa"/>
           </w:tcPr>
-          <w:tcPr/>
           <w:p>
             <w:pPr>
               <w:pStyle w:val="Compact"/>
@@ -16417,7 +16188,6 @@
           <w:tcPr>
             <w:tcW w:w="3868" w:type="dxa"/>
           </w:tcPr>
-          <w:tcPr/>
           <w:p>
             <w:pPr>
               <w:pStyle w:val="Compact"/>
@@ -16469,7 +16239,6 @@
           <w:tcPr>
             <w:tcW w:w="2256" w:type="dxa"/>
           </w:tcPr>
-          <w:tcPr/>
           <w:p>
             <w:pPr>
               <w:pStyle w:val="Compact"/>
@@ -16488,7 +16257,6 @@
           <w:tcPr>
             <w:tcW w:w="2902" w:type="dxa"/>
           </w:tcPr>
-          <w:tcPr/>
           <w:p>
             <w:pPr>
               <w:pStyle w:val="Compact"/>
@@ -16509,7 +16277,6 @@
           <w:tcPr>
             <w:tcW w:w="3868" w:type="dxa"/>
           </w:tcPr>
-          <w:tcPr/>
           <w:p>
             <w:pPr>
               <w:pStyle w:val="Compact"/>
@@ -16528,7 +16295,6 @@
           <w:tcPr>
             <w:tcW w:w="2256" w:type="dxa"/>
           </w:tcPr>
-          <w:tcPr/>
           <w:p>
             <w:pPr>
               <w:pStyle w:val="Compact"/>
@@ -16547,7 +16313,6 @@
           <w:tcPr>
             <w:tcW w:w="2902" w:type="dxa"/>
           </w:tcPr>
-          <w:tcPr/>
           <w:p>
             <w:pPr>
               <w:pStyle w:val="Compact"/>
@@ -16568,7 +16333,6 @@
           <w:tcPr>
             <w:tcW w:w="3868" w:type="dxa"/>
           </w:tcPr>
-          <w:tcPr/>
           <w:p>
             <w:pPr>
               <w:pStyle w:val="Compact"/>
@@ -16620,7 +16384,6 @@
           <w:tcPr>
             <w:tcW w:w="2256" w:type="dxa"/>
           </w:tcPr>
-          <w:tcPr/>
           <w:p>
             <w:pPr>
               <w:pStyle w:val="Compact"/>
@@ -16639,7 +16402,6 @@
           <w:tcPr>
             <w:tcW w:w="2902" w:type="dxa"/>
           </w:tcPr>
-          <w:tcPr/>
           <w:p>
             <w:pPr>
               <w:pStyle w:val="Compact"/>
@@ -16660,7 +16422,6 @@
           <w:tcPr>
             <w:tcW w:w="3868" w:type="dxa"/>
           </w:tcPr>
-          <w:tcPr/>
           <w:p>
             <w:pPr>
               <w:pStyle w:val="Compact"/>
@@ -16712,7 +16473,6 @@
           <w:tcPr>
             <w:tcW w:w="2256" w:type="dxa"/>
           </w:tcPr>
-          <w:tcPr/>
           <w:p>
             <w:pPr>
               <w:pStyle w:val="Compact"/>
@@ -16731,7 +16491,6 @@
           <w:tcPr>
             <w:tcW w:w="2902" w:type="dxa"/>
           </w:tcPr>
-          <w:tcPr/>
           <w:p>
             <w:pPr>
               <w:pStyle w:val="Compact"/>
@@ -16752,7 +16511,6 @@
           <w:tcPr>
             <w:tcW w:w="3868" w:type="dxa"/>
           </w:tcPr>
-          <w:tcPr/>
           <w:p>
             <w:pPr>
               <w:pStyle w:val="Compact"/>
@@ -16771,7 +16529,6 @@
           <w:tcPr>
             <w:tcW w:w="2256" w:type="dxa"/>
           </w:tcPr>
-          <w:tcPr/>
           <w:p>
             <w:pPr>
               <w:pStyle w:val="Compact"/>
@@ -16790,7 +16547,6 @@
           <w:tcPr>
             <w:tcW w:w="2902" w:type="dxa"/>
           </w:tcPr>
-          <w:tcPr/>
           <w:p>
             <w:pPr>
               <w:pStyle w:val="Compact"/>
@@ -16811,7 +16567,6 @@
           <w:tcPr>
             <w:tcW w:w="3868" w:type="dxa"/>
           </w:tcPr>
-          <w:tcPr/>
           <w:p>
             <w:pPr>
               <w:pStyle w:val="Compact"/>
@@ -16830,7 +16585,6 @@
           <w:tcPr>
             <w:tcW w:w="2256" w:type="dxa"/>
           </w:tcPr>
-          <w:tcPr/>
           <w:p>
             <w:pPr>
               <w:pStyle w:val="Compact"/>
@@ -16849,7 +16603,6 @@
           <w:tcPr>
             <w:tcW w:w="2902" w:type="dxa"/>
           </w:tcPr>
-          <w:tcPr/>
           <w:p>
             <w:pPr>
               <w:pStyle w:val="Compact"/>
@@ -16870,7 +16623,6 @@
           <w:tcPr>
             <w:tcW w:w="3868" w:type="dxa"/>
           </w:tcPr>
-          <w:tcPr/>
           <w:p>
             <w:pPr>
               <w:pStyle w:val="Compact"/>
@@ -16889,7 +16641,6 @@
           <w:tcPr>
             <w:tcW w:w="2256" w:type="dxa"/>
           </w:tcPr>
-          <w:tcPr/>
           <w:p>
             <w:pPr>
               <w:pStyle w:val="Compact"/>
@@ -16908,7 +16659,6 @@
           <w:tcPr>
             <w:tcW w:w="2902" w:type="dxa"/>
           </w:tcPr>
-          <w:tcPr/>
           <w:p>
             <w:pPr>
               <w:pStyle w:val="Compact"/>
@@ -16929,7 +16679,6 @@
           <w:tcPr>
             <w:tcW w:w="3868" w:type="dxa"/>
           </w:tcPr>
-          <w:tcPr/>
           <w:p>
             <w:pPr>
               <w:pStyle w:val="Compact"/>
@@ -16948,7 +16697,6 @@
           <w:tcPr>
             <w:tcW w:w="2256" w:type="dxa"/>
           </w:tcPr>
-          <w:tcPr/>
           <w:p>
             <w:pPr>
               <w:pStyle w:val="Compact"/>
@@ -16967,7 +16715,6 @@
           <w:tcPr>
             <w:tcW w:w="2902" w:type="dxa"/>
           </w:tcPr>
-          <w:tcPr/>
           <w:p>
             <w:pPr>
               <w:pStyle w:val="Compact"/>
@@ -16988,7 +16735,6 @@
           <w:tcPr>
             <w:tcW w:w="3868" w:type="dxa"/>
           </w:tcPr>
-          <w:tcPr/>
           <w:p>
             <w:pPr>
               <w:pStyle w:val="Compact"/>
@@ -17007,7 +16753,6 @@
           <w:tcPr>
             <w:tcW w:w="2256" w:type="dxa"/>
           </w:tcPr>
-          <w:tcPr/>
           <w:p>
             <w:pPr>
               <w:pStyle w:val="Compact"/>
@@ -17026,7 +16771,6 @@
           <w:tcPr>
             <w:tcW w:w="2902" w:type="dxa"/>
           </w:tcPr>
-          <w:tcPr/>
           <w:p>
             <w:pPr>
               <w:pStyle w:val="Compact"/>
@@ -17090,7 +16834,6 @@
           <w:tcPr>
             <w:tcW w:w="2297" w:type="dxa"/>
           </w:tcPr>
-          <w:tcPr/>
           <w:p>
             <w:pPr>
               <w:pStyle w:val="Compact"/>
@@ -17109,7 +16852,6 @@
           <w:tcPr>
             <w:tcW w:w="1476" w:type="dxa"/>
           </w:tcPr>
-          <w:tcPr/>
           <w:p>
             <w:pPr>
               <w:pStyle w:val="Compact"/>
@@ -17128,7 +16870,6 @@
           <w:tcPr>
             <w:tcW w:w="2297" w:type="dxa"/>
           </w:tcPr>
-          <w:tcPr/>
           <w:p>
             <w:pPr>
               <w:pStyle w:val="Compact"/>
@@ -17147,7 +16888,6 @@
           <w:tcPr>
             <w:tcW w:w="2956" w:type="dxa"/>
           </w:tcPr>
-          <w:tcPr/>
           <w:p>
             <w:pPr>
               <w:pStyle w:val="Compact"/>
@@ -17168,7 +16908,6 @@
           <w:tcPr>
             <w:tcW w:w="2297" w:type="dxa"/>
           </w:tcPr>
-          <w:tcPr/>
           <w:p>
             <w:pPr>
               <w:pStyle w:val="Compact"/>
@@ -17188,7 +16927,6 @@
           <w:tcPr>
             <w:tcW w:w="1476" w:type="dxa"/>
           </w:tcPr>
-          <w:tcPr/>
           <w:p>
             <w:pPr>
               <w:pStyle w:val="Compact"/>
@@ -17207,7 +16945,6 @@
           <w:tcPr>
             <w:tcW w:w="2297" w:type="dxa"/>
           </w:tcPr>
-          <w:tcPr/>
           <w:p>
             <w:pPr>
               <w:pStyle w:val="Compact"/>
@@ -17226,7 +16963,6 @@
           <w:tcPr>
             <w:tcW w:w="2956" w:type="dxa"/>
           </w:tcPr>
-          <w:tcPr/>
           <w:p>
             <w:pPr>
               <w:pStyle w:val="Compact"/>
@@ -17247,7 +16983,6 @@
           <w:tcPr>
             <w:tcW w:w="2297" w:type="dxa"/>
           </w:tcPr>
-          <w:tcPr/>
           <w:p>
             <w:pPr>
               <w:pStyle w:val="Compact"/>
@@ -17281,7 +17016,6 @@
           <w:tcPr>
             <w:tcW w:w="1476" w:type="dxa"/>
           </w:tcPr>
-          <w:tcPr/>
           <w:p>
             <w:pPr>
               <w:pStyle w:val="Compact"/>
@@ -17300,7 +17034,6 @@
           <w:tcPr>
             <w:tcW w:w="2297" w:type="dxa"/>
           </w:tcPr>
-          <w:tcPr/>
           <w:p>
             <w:pPr>
               <w:pStyle w:val="Compact"/>
@@ -17319,7 +17052,6 @@
           <w:tcPr>
             <w:tcW w:w="2956" w:type="dxa"/>
           </w:tcPr>
-          <w:tcPr/>
           <w:p>
             <w:pPr>
               <w:pStyle w:val="Compact"/>
@@ -17340,7 +17072,6 @@
           <w:tcPr>
             <w:tcW w:w="2297" w:type="dxa"/>
           </w:tcPr>
-          <w:tcPr/>
           <w:p>
             <w:pPr>
               <w:pStyle w:val="Compact"/>
@@ -17360,7 +17091,6 @@
           <w:tcPr>
             <w:tcW w:w="1476" w:type="dxa"/>
           </w:tcPr>
-          <w:tcPr/>
           <w:p>
             <w:pPr>
               <w:pStyle w:val="Compact"/>
@@ -17379,7 +17109,6 @@
           <w:tcPr>
             <w:tcW w:w="2297" w:type="dxa"/>
           </w:tcPr>
-          <w:tcPr/>
           <w:p>
             <w:pPr>
               <w:pStyle w:val="Compact"/>
@@ -17398,7 +17127,6 @@
           <w:tcPr>
             <w:tcW w:w="2956" w:type="dxa"/>
           </w:tcPr>
-          <w:tcPr/>
           <w:p>
             <w:pPr>
               <w:pStyle w:val="Compact"/>
@@ -17419,7 +17147,6 @@
           <w:tcPr>
             <w:tcW w:w="2297" w:type="dxa"/>
           </w:tcPr>
-          <w:tcPr/>
           <w:p>
             <w:pPr>
               <w:pStyle w:val="Compact"/>
@@ -17439,7 +17166,6 @@
           <w:tcPr>
             <w:tcW w:w="1476" w:type="dxa"/>
           </w:tcPr>
-          <w:tcPr/>
           <w:p>
             <w:pPr>
               <w:pStyle w:val="Compact"/>
@@ -17458,7 +17184,6 @@
           <w:tcPr>
             <w:tcW w:w="2297" w:type="dxa"/>
           </w:tcPr>
-          <w:tcPr/>
           <w:p>
             <w:pPr>
               <w:pStyle w:val="Compact"/>
@@ -17477,7 +17202,6 @@
           <w:tcPr>
             <w:tcW w:w="2956" w:type="dxa"/>
           </w:tcPr>
-          <w:tcPr/>
           <w:p>
             <w:pPr>
               <w:pStyle w:val="Compact"/>
@@ -17498,7 +17222,6 @@
           <w:tcPr>
             <w:tcW w:w="2297" w:type="dxa"/>
           </w:tcPr>
-          <w:tcPr/>
           <w:p>
             <w:pPr>
               <w:pStyle w:val="Compact"/>
@@ -17518,7 +17241,6 @@
           <w:tcPr>
             <w:tcW w:w="1476" w:type="dxa"/>
           </w:tcPr>
-          <w:tcPr/>
           <w:p>
             <w:pPr>
               <w:pStyle w:val="Compact"/>
@@ -17537,7 +17259,6 @@
           <w:tcPr>
             <w:tcW w:w="2297" w:type="dxa"/>
           </w:tcPr>
-          <w:tcPr/>
           <w:p>
             <w:pPr>
               <w:pStyle w:val="Compact"/>
@@ -17556,7 +17277,6 @@
           <w:tcPr>
             <w:tcW w:w="2956" w:type="dxa"/>
           </w:tcPr>
-          <w:tcPr/>
           <w:p>
             <w:pPr>
               <w:pStyle w:val="Compact"/>
@@ -17577,7 +17297,6 @@
           <w:tcPr>
             <w:tcW w:w="2297" w:type="dxa"/>
           </w:tcPr>
-          <w:tcPr/>
           <w:p>
             <w:pPr>
               <w:pStyle w:val="Compact"/>
@@ -17597,7 +17316,6 @@
           <w:tcPr>
             <w:tcW w:w="1476" w:type="dxa"/>
           </w:tcPr>
-          <w:tcPr/>
           <w:p>
             <w:pPr>
               <w:pStyle w:val="Compact"/>
@@ -17616,7 +17334,6 @@
           <w:tcPr>
             <w:tcW w:w="2297" w:type="dxa"/>
           </w:tcPr>
-          <w:tcPr/>
           <w:p>
             <w:pPr>
               <w:pStyle w:val="Compact"/>
@@ -17635,7 +17352,6 @@
           <w:tcPr>
             <w:tcW w:w="2956" w:type="dxa"/>
           </w:tcPr>
-          <w:tcPr/>
           <w:p>
             <w:pPr>
               <w:pStyle w:val="Compact"/>
@@ -17656,7 +17372,6 @@
           <w:tcPr>
             <w:tcW w:w="2297" w:type="dxa"/>
           </w:tcPr>
-          <w:tcPr/>
           <w:p>
             <w:pPr>
               <w:pStyle w:val="Compact"/>
@@ -17698,7 +17413,6 @@
           <w:tcPr>
             <w:tcW w:w="1476" w:type="dxa"/>
           </w:tcPr>
-          <w:tcPr/>
           <w:p>
             <w:pPr>
               <w:pStyle w:val="Compact"/>
@@ -17717,7 +17431,6 @@
           <w:tcPr>
             <w:tcW w:w="2297" w:type="dxa"/>
           </w:tcPr>
-          <w:tcPr/>
           <w:p>
             <w:pPr>
               <w:pStyle w:val="Compact"/>
@@ -17736,7 +17449,6 @@
           <w:tcPr>
             <w:tcW w:w="2956" w:type="dxa"/>
           </w:tcPr>
-          <w:tcPr/>
           <w:p>
             <w:pPr>
               <w:pStyle w:val="Compact"/>

</xml_diff>